<commit_message>
docs: apartados 30.8 y 30.9 del documento del proyecto
30.8  Recuperacion de contrasena por correo. Explica la suposicion
      equivocada que sostenia el mecanismo anterior —tratar la cedula como
      un secreto cuando en Colombia aparece en contratos, formularios y
      filtraciones—, las cinco decisiones de diseno que sostienen el esquema
      nuevo, el criterio para elegir proveedor sin disponer de dominio
      propio, y la incidencia de la puesta en marcha.

30.9  Pruebas automatizadas e integracion continua. Las 58 pruebas y lo que
      cubre cada conjunto, por que se extrajeron dos reglas de negocio a
      funciones independientes, y por que la integracion usa instalacion
      limpia y la misma version del entorno que produccion.

Incluye el episodio de la prueba que fallaba por un error en la propia
prueba: ilustra que una prueba en rojo no siempre acusa al codigo.

Co-Authored-By: Claude Opus 5 <noreply@anthropic.com>
</commit_message>
<xml_diff>
--- a/docs/EntryTech_Final_DEFINITIVO.docx
+++ b/docs/EntryTech_Final_DEFINITIVO.docx
@@ -40099,6 +40099,1058 @@
       </w:pPr>
       <w:r>
         <w:t xml:space="preserve">Las cinco incidencias del informe quedan resueltas, junto con dos problemas de control de acceso y dos defectos de robustez que el propio proceso de verificación sacó a la luz. Conviene retener ese dato: más de la mitad de lo corregido en esta fase no figuraba en el informe original, sino que apareció al comprobar las correcciones contra el sistema real.</w:t>
+      </w:r>
+    </w:p>
+    <w:p>
+      <w:r>
+        <w:br w:type="page"/>
+      </w:r>
+    </w:p>
+    <w:p>
+      <w:pPr>
+        <w:pStyle w:val="Ttulo2"/>
+        <w:pBdr>
+          <w:bottom w:val="single" w:sz="4" w:space="0" w:color="2E75B6"/>
+        </w:pBdr>
+      </w:pPr>
+      <w:r>
+        <w:t xml:space="preserve">30.8. Recuperación de contraseña por correo electrónico</w:t>
+      </w:r>
+    </w:p>
+    <w:p>
+      <w:pPr>
+        <w:spacing w:after="120"/>
+      </w:pPr>
+      <w:r>
+        <w:t xml:space="preserve">El sistema arrastraba desde su primera versión un mecanismo de recuperación que permitía cambiar la contraseña presentando dos datos: el correo electrónico y el número de cédula. La auditoría de la sección 25 lo señaló como la vulnerabilidad de mayor alcance que quedaba sin resolver, y la mitigó parcialmente añadiendo un límite de intentos y una política de contraseñas, pero sin corregir el fondo del problema.</w:t>
+      </w:r>
+    </w:p>
+    <w:p>
+      <w:pPr>
+        <w:shd w:val="clear" w:color="auto" w:fill="F2F2F2"/>
+        <w:spacing w:before="300" w:after="300"/>
+        <w:ind w:left="360" w:right="360"/>
+      </w:pPr>
+      <w:r>
+        <w:t xml:space="preserve">El fondo del problema es una suposición equivocada: tratar la cédula como un secreto. En Colombia el número de documento aparece en contratos, formularios, bases de datos comerciales y filtraciones. Cualquiera que conociera dos datos públicos de una persona podía apoderarse de su cuenta, incluida la de un administrador.</w:t>
+      </w:r>
+    </w:p>
+    <w:p>
+      <w:pPr>
+        <w:pStyle w:val="Ttulo3"/>
+      </w:pPr>
+      <w:r>
+        <w:t xml:space="preserve">El mecanismo adoptado</w:t>
+      </w:r>
+    </w:p>
+    <w:p>
+      <w:pPr>
+        <w:spacing w:after="120"/>
+      </w:pPr>
+      <w:r>
+        <w:t xml:space="preserve">La prueba de identidad pasa a ser el acceso al buzón de correo registrado, que sí está bajo el control exclusivo del titular. El flujo tiene dos pasos:</w:t>
+      </w:r>
+    </w:p>
+    <w:p>
+      <w:pPr>
+        <w:spacing w:after="80"/>
+        <w:ind w:left="360"/>
+      </w:pPr>
+      <w:r>
+        <w:t xml:space="preserve">• El usuario indica su correo. El sistema genera un enlace temporal y se lo envía.</w:t>
+      </w:r>
+    </w:p>
+    <w:p>
+      <w:pPr>
+        <w:spacing w:after="80"/>
+        <w:ind w:left="360"/>
+      </w:pPr>
+      <w:r>
+        <w:t xml:space="preserve">• El usuario abre el enlace y elige una contraseña nueva.</w:t>
+      </w:r>
+    </w:p>
+    <w:p>
+      <w:pPr>
+        <w:spacing w:after="120"/>
+      </w:pPr>
+      <w:r>
+        <w:t xml:space="preserve">Las decisiones de diseño que sostienen la seguridad del esquema son cinco:</w:t>
+      </w:r>
+    </w:p>
+    <w:tbl>
+      <w:tblPr>
+        <w:tblW w:w="9360" w:type="dxa"/>
+        <w:tblBorders>
+          <w:top w:val="single" w:sz="4" w:space="0" w:color="auto"/>
+          <w:left w:val="single" w:sz="4" w:space="0" w:color="auto"/>
+          <w:bottom w:val="single" w:sz="4" w:space="0" w:color="auto"/>
+          <w:right w:val="single" w:sz="4" w:space="0" w:color="auto"/>
+          <w:insideH w:val="single" w:sz="4" w:space="0" w:color="auto"/>
+          <w:insideV w:val="single" w:sz="4" w:space="0" w:color="auto"/>
+        </w:tblBorders>
+        <w:tblCellMar>
+          <w:left w:w="10" w:type="dxa"/>
+          <w:right w:w="10" w:type="dxa"/>
+        </w:tblCellMar>
+        <w:tblLook w:val="04A0" w:firstRow="1" w:lastRow="0" w:firstColumn="1" w:lastColumn="0" w:noHBand="0" w:noVBand="1"/>
+      </w:tblPr>
+      <w:tblGrid>
+        <w:gridCol w:w="3744"/>
+        <w:gridCol w:w="5616"/>
+      </w:tblGrid>
+      <w:tr>
+        <w:trPr>
+          <w:tblHeader/>
+        </w:trPr>
+        <w:tc>
+          <w:tcPr>
+            <w:tcW w:w="3744" w:type="dxa"/>
+            <w:tcBorders>
+              <w:top w:val="single" w:sz="1" w:space="0" w:color="CCCCCC"/>
+              <w:left w:val="single" w:sz="1" w:space="0" w:color="CCCCCC"/>
+              <w:bottom w:val="single" w:sz="1" w:space="0" w:color="CCCCCC"/>
+              <w:right w:val="single" w:sz="1" w:space="0" w:color="CCCCCC"/>
+            </w:tcBorders>
+            <w:shd w:val="clear" w:color="auto" w:fill="1E3A5F"/>
+            <w:tcMar>
+              <w:top w:w="80" w:type="dxa"/>
+              <w:left w:w="120" w:type="dxa"/>
+              <w:bottom w:w="80" w:type="dxa"/>
+              <w:right w:w="120" w:type="dxa"/>
+            </w:tcMar>
+          </w:tcPr>
+          <w:p>
+            <w:pPr>
+              <w:spacing w:after="0"/>
+            </w:pPr>
+            <w:r>
+              <w:rPr>
+                <w:b/>
+                <w:bCs/>
+                <w:color w:val="FFFFFF"/>
+                <w:sz w:val="18"/>
+                <w:szCs w:val="18"/>
+              </w:rPr>
+              <w:t xml:space="preserve">Decisión</w:t>
+            </w:r>
+          </w:p>
+        </w:tc>
+        <w:tc>
+          <w:tcPr>
+            <w:tcW w:w="5616" w:type="dxa"/>
+            <w:tcBorders>
+              <w:top w:val="single" w:sz="1" w:space="0" w:color="CCCCCC"/>
+              <w:left w:val="single" w:sz="1" w:space="0" w:color="CCCCCC"/>
+              <w:bottom w:val="single" w:sz="1" w:space="0" w:color="CCCCCC"/>
+              <w:right w:val="single" w:sz="1" w:space="0" w:color="CCCCCC"/>
+            </w:tcBorders>
+            <w:shd w:val="clear" w:color="auto" w:fill="1E3A5F"/>
+            <w:tcMar>
+              <w:top w:w="80" w:type="dxa"/>
+              <w:left w:w="120" w:type="dxa"/>
+              <w:bottom w:w="80" w:type="dxa"/>
+              <w:right w:w="120" w:type="dxa"/>
+            </w:tcMar>
+          </w:tcPr>
+          <w:p>
+            <w:pPr>
+              <w:spacing w:after="0"/>
+            </w:pPr>
+            <w:r>
+              <w:rPr>
+                <w:b/>
+                <w:bCs/>
+                <w:color w:val="FFFFFF"/>
+                <w:sz w:val="18"/>
+                <w:szCs w:val="18"/>
+              </w:rPr>
+              <w:t xml:space="preserve">Razón</w:t>
+            </w:r>
+          </w:p>
+        </w:tc>
+      </w:tr>
+      <w:tr>
+        <w:tc>
+          <w:tcPr>
+            <w:tcW w:w="3744" w:type="dxa"/>
+            <w:tcBorders>
+              <w:top w:val="single" w:sz="1" w:space="0" w:color="CCCCCC"/>
+              <w:left w:val="single" w:sz="1" w:space="0" w:color="CCCCCC"/>
+              <w:bottom w:val="single" w:sz="1" w:space="0" w:color="CCCCCC"/>
+              <w:right w:val="single" w:sz="1" w:space="0" w:color="CCCCCC"/>
+            </w:tcBorders>
+            <w:shd w:val="clear" w:color="auto" w:fill="FFFFFF"/>
+            <w:tcMar>
+              <w:top w:w="80" w:type="dxa"/>
+              <w:left w:w="120" w:type="dxa"/>
+              <w:bottom w:w="80" w:type="dxa"/>
+              <w:right w:w="120" w:type="dxa"/>
+            </w:tcMar>
+          </w:tcPr>
+          <w:p>
+            <w:pPr>
+              <w:spacing w:after="0"/>
+            </w:pPr>
+            <w:r>
+              <w:rPr>
+                <w:color w:val="1A1A2E"/>
+                <w:sz w:val="18"/>
+                <w:szCs w:val="18"/>
+              </w:rPr>
+              <w:t xml:space="preserve">La respuesta es idéntica exista o no la cuenta</w:t>
+            </w:r>
+          </w:p>
+        </w:tc>
+        <w:tc>
+          <w:tcPr>
+            <w:tcW w:w="5616" w:type="dxa"/>
+            <w:tcBorders>
+              <w:top w:val="single" w:sz="1" w:space="0" w:color="CCCCCC"/>
+              <w:left w:val="single" w:sz="1" w:space="0" w:color="CCCCCC"/>
+              <w:bottom w:val="single" w:sz="1" w:space="0" w:color="CCCCCC"/>
+              <w:right w:val="single" w:sz="1" w:space="0" w:color="CCCCCC"/>
+            </w:tcBorders>
+            <w:shd w:val="clear" w:color="auto" w:fill="FFFFFF"/>
+            <w:tcMar>
+              <w:top w:w="80" w:type="dxa"/>
+              <w:left w:w="120" w:type="dxa"/>
+              <w:bottom w:w="80" w:type="dxa"/>
+              <w:right w:w="120" w:type="dxa"/>
+            </w:tcMar>
+          </w:tcPr>
+          <w:p>
+            <w:pPr>
+              <w:spacing w:after="0"/>
+            </w:pPr>
+            <w:r>
+              <w:rPr>
+                <w:color w:val="1A1A2E"/>
+                <w:sz w:val="18"/>
+                <w:szCs w:val="18"/>
+              </w:rPr>
+              <w:t xml:space="preserve">Contestar «no encontramos ese correo» permitiría averiguar qué direcciones están registradas probando una lista. Es el mismo criterio aplicado al inicio de sesión en la sección 25.</w:t>
+            </w:r>
+          </w:p>
+        </w:tc>
+      </w:tr>
+      <w:tr>
+        <w:tc>
+          <w:tcPr>
+            <w:tcW w:w="3744" w:type="dxa"/>
+            <w:tcBorders>
+              <w:top w:val="single" w:sz="1" w:space="0" w:color="CCCCCC"/>
+              <w:left w:val="single" w:sz="1" w:space="0" w:color="CCCCCC"/>
+              <w:bottom w:val="single" w:sz="1" w:space="0" w:color="CCCCCC"/>
+              <w:right w:val="single" w:sz="1" w:space="0" w:color="CCCCCC"/>
+            </w:tcBorders>
+            <w:shd w:val="clear" w:color="auto" w:fill="F7F9FC"/>
+            <w:tcMar>
+              <w:top w:w="80" w:type="dxa"/>
+              <w:left w:w="120" w:type="dxa"/>
+              <w:bottom w:w="80" w:type="dxa"/>
+              <w:right w:w="120" w:type="dxa"/>
+            </w:tcMar>
+          </w:tcPr>
+          <w:p>
+            <w:pPr>
+              <w:spacing w:after="0"/>
+            </w:pPr>
+            <w:r>
+              <w:rPr>
+                <w:color w:val="1A1A2E"/>
+                <w:sz w:val="18"/>
+                <w:szCs w:val="18"/>
+              </w:rPr>
+              <w:t xml:space="preserve">En la base de datos se guarda la huella SHA-256 del token, nunca su valor</w:t>
+            </w:r>
+          </w:p>
+        </w:tc>
+        <w:tc>
+          <w:tcPr>
+            <w:tcW w:w="5616" w:type="dxa"/>
+            <w:tcBorders>
+              <w:top w:val="single" w:sz="1" w:space="0" w:color="CCCCCC"/>
+              <w:left w:val="single" w:sz="1" w:space="0" w:color="CCCCCC"/>
+              <w:bottom w:val="single" w:sz="1" w:space="0" w:color="CCCCCC"/>
+              <w:right w:val="single" w:sz="1" w:space="0" w:color="CCCCCC"/>
+            </w:tcBorders>
+            <w:shd w:val="clear" w:color="auto" w:fill="F7F9FC"/>
+            <w:tcMar>
+              <w:top w:w="80" w:type="dxa"/>
+              <w:left w:w="120" w:type="dxa"/>
+              <w:bottom w:w="80" w:type="dxa"/>
+              <w:right w:w="120" w:type="dxa"/>
+            </w:tcMar>
+          </w:tcPr>
+          <w:p>
+            <w:pPr>
+              <w:spacing w:after="0"/>
+            </w:pPr>
+            <w:r>
+              <w:rPr>
+                <w:color w:val="1A1A2E"/>
+                <w:sz w:val="18"/>
+                <w:szCs w:val="18"/>
+              </w:rPr>
+              <w:t xml:space="preserve">Quien consiguiera leer la tabla no podría reconstruir ningún enlace. Es el mismo principio por el que las contraseñas no se almacenan en claro.</w:t>
+            </w:r>
+          </w:p>
+        </w:tc>
+      </w:tr>
+      <w:tr>
+        <w:tc>
+          <w:tcPr>
+            <w:tcW w:w="3744" w:type="dxa"/>
+            <w:tcBorders>
+              <w:top w:val="single" w:sz="1" w:space="0" w:color="CCCCCC"/>
+              <w:left w:val="single" w:sz="1" w:space="0" w:color="CCCCCC"/>
+              <w:bottom w:val="single" w:sz="1" w:space="0" w:color="CCCCCC"/>
+              <w:right w:val="single" w:sz="1" w:space="0" w:color="CCCCCC"/>
+            </w:tcBorders>
+            <w:shd w:val="clear" w:color="auto" w:fill="FFFFFF"/>
+            <w:tcMar>
+              <w:top w:w="80" w:type="dxa"/>
+              <w:left w:w="120" w:type="dxa"/>
+              <w:bottom w:w="80" w:type="dxa"/>
+              <w:right w:w="120" w:type="dxa"/>
+            </w:tcMar>
+          </w:tcPr>
+          <w:p>
+            <w:pPr>
+              <w:spacing w:after="0"/>
+            </w:pPr>
+            <w:r>
+              <w:rPr>
+                <w:color w:val="1A1A2E"/>
+                <w:sz w:val="18"/>
+                <w:szCs w:val="18"/>
+              </w:rPr>
+              <w:t xml:space="preserve">El enlace caduca en una hora y solo sirve una vez</w:t>
+            </w:r>
+          </w:p>
+        </w:tc>
+        <w:tc>
+          <w:tcPr>
+            <w:tcW w:w="5616" w:type="dxa"/>
+            <w:tcBorders>
+              <w:top w:val="single" w:sz="1" w:space="0" w:color="CCCCCC"/>
+              <w:left w:val="single" w:sz="1" w:space="0" w:color="CCCCCC"/>
+              <w:bottom w:val="single" w:sz="1" w:space="0" w:color="CCCCCC"/>
+              <w:right w:val="single" w:sz="1" w:space="0" w:color="CCCCCC"/>
+            </w:tcBorders>
+            <w:shd w:val="clear" w:color="auto" w:fill="FFFFFF"/>
+            <w:tcMar>
+              <w:top w:w="80" w:type="dxa"/>
+              <w:left w:w="120" w:type="dxa"/>
+              <w:bottom w:w="80" w:type="dxa"/>
+              <w:right w:w="120" w:type="dxa"/>
+            </w:tcMar>
+          </w:tcPr>
+          <w:p>
+            <w:pPr>
+              <w:spacing w:after="0"/>
+            </w:pPr>
+            <w:r>
+              <w:rPr>
+                <w:color w:val="1A1A2E"/>
+                <w:sz w:val="18"/>
+                <w:szCs w:val="18"/>
+              </w:rPr>
+              <w:t xml:space="preserve">Limita la ventana de aprovechamiento si el correo quedara expuesto, y evita que un enlace reenviado o guardado vuelva a funcionar.</w:t>
+            </w:r>
+          </w:p>
+        </w:tc>
+      </w:tr>
+      <w:tr>
+        <w:tc>
+          <w:tcPr>
+            <w:tcW w:w="3744" w:type="dxa"/>
+            <w:tcBorders>
+              <w:top w:val="single" w:sz="1" w:space="0" w:color="CCCCCC"/>
+              <w:left w:val="single" w:sz="1" w:space="0" w:color="CCCCCC"/>
+              <w:bottom w:val="single" w:sz="1" w:space="0" w:color="CCCCCC"/>
+              <w:right w:val="single" w:sz="1" w:space="0" w:color="CCCCCC"/>
+            </w:tcBorders>
+            <w:shd w:val="clear" w:color="auto" w:fill="F7F9FC"/>
+            <w:tcMar>
+              <w:top w:w="80" w:type="dxa"/>
+              <w:left w:w="120" w:type="dxa"/>
+              <w:bottom w:w="80" w:type="dxa"/>
+              <w:right w:w="120" w:type="dxa"/>
+            </w:tcMar>
+          </w:tcPr>
+          <w:p>
+            <w:pPr>
+              <w:spacing w:after="0"/>
+            </w:pPr>
+            <w:r>
+              <w:rPr>
+                <w:color w:val="1A1A2E"/>
+                <w:sz w:val="18"/>
+                <w:szCs w:val="18"/>
+              </w:rPr>
+              <w:t xml:space="preserve">Pedir un enlace nuevo anula los anteriores</w:t>
+            </w:r>
+          </w:p>
+        </w:tc>
+        <w:tc>
+          <w:tcPr>
+            <w:tcW w:w="5616" w:type="dxa"/>
+            <w:tcBorders>
+              <w:top w:val="single" w:sz="1" w:space="0" w:color="CCCCCC"/>
+              <w:left w:val="single" w:sz="1" w:space="0" w:color="CCCCCC"/>
+              <w:bottom w:val="single" w:sz="1" w:space="0" w:color="CCCCCC"/>
+              <w:right w:val="single" w:sz="1" w:space="0" w:color="CCCCCC"/>
+            </w:tcBorders>
+            <w:shd w:val="clear" w:color="auto" w:fill="F7F9FC"/>
+            <w:tcMar>
+              <w:top w:w="80" w:type="dxa"/>
+              <w:left w:w="120" w:type="dxa"/>
+              <w:bottom w:w="80" w:type="dxa"/>
+              <w:right w:w="120" w:type="dxa"/>
+            </w:tcMar>
+          </w:tcPr>
+          <w:p>
+            <w:pPr>
+              <w:spacing w:after="0"/>
+            </w:pPr>
+            <w:r>
+              <w:rPr>
+                <w:color w:val="1A1A2E"/>
+                <w:sz w:val="18"/>
+                <w:szCs w:val="18"/>
+              </w:rPr>
+              <w:t xml:space="preserve">De lo contrario, varias solicitudes dejarían varios enlaces válidos a la vez y bastaría con que uno se filtrara.</w:t>
+            </w:r>
+          </w:p>
+        </w:tc>
+      </w:tr>
+      <w:tr>
+        <w:tc>
+          <w:tcPr>
+            <w:tcW w:w="3744" w:type="dxa"/>
+            <w:tcBorders>
+              <w:top w:val="single" w:sz="1" w:space="0" w:color="CCCCCC"/>
+              <w:left w:val="single" w:sz="1" w:space="0" w:color="CCCCCC"/>
+              <w:bottom w:val="single" w:sz="1" w:space="0" w:color="CCCCCC"/>
+              <w:right w:val="single" w:sz="1" w:space="0" w:color="CCCCCC"/>
+            </w:tcBorders>
+            <w:shd w:val="clear" w:color="auto" w:fill="FFFFFF"/>
+            <w:tcMar>
+              <w:top w:w="80" w:type="dxa"/>
+              <w:left w:w="120" w:type="dxa"/>
+              <w:bottom w:w="80" w:type="dxa"/>
+              <w:right w:w="120" w:type="dxa"/>
+            </w:tcMar>
+          </w:tcPr>
+          <w:p>
+            <w:pPr>
+              <w:spacing w:after="0"/>
+            </w:pPr>
+            <w:r>
+              <w:rPr>
+                <w:color w:val="1A1A2E"/>
+                <w:sz w:val="18"/>
+                <w:szCs w:val="18"/>
+              </w:rPr>
+              <w:t xml:space="preserve">El canje ocurre en una transacción con bloqueo de fila</w:t>
+            </w:r>
+          </w:p>
+        </w:tc>
+        <w:tc>
+          <w:tcPr>
+            <w:tcW w:w="5616" w:type="dxa"/>
+            <w:tcBorders>
+              <w:top w:val="single" w:sz="1" w:space="0" w:color="CCCCCC"/>
+              <w:left w:val="single" w:sz="1" w:space="0" w:color="CCCCCC"/>
+              <w:bottom w:val="single" w:sz="1" w:space="0" w:color="CCCCCC"/>
+              <w:right w:val="single" w:sz="1" w:space="0" w:color="CCCCCC"/>
+            </w:tcBorders>
+            <w:shd w:val="clear" w:color="auto" w:fill="FFFFFF"/>
+            <w:tcMar>
+              <w:top w:w="80" w:type="dxa"/>
+              <w:left w:w="120" w:type="dxa"/>
+              <w:bottom w:w="80" w:type="dxa"/>
+              <w:right w:w="120" w:type="dxa"/>
+            </w:tcMar>
+          </w:tcPr>
+          <w:p>
+            <w:pPr>
+              <w:spacing w:after="0"/>
+            </w:pPr>
+            <w:r>
+              <w:rPr>
+                <w:color w:val="1A1A2E"/>
+                <w:sz w:val="18"/>
+                <w:szCs w:val="18"/>
+              </w:rPr>
+              <w:t xml:space="preserve">Impide que dos peticiones simultáneas con el mismo enlace lo canjeen ambas.</w:t>
+            </w:r>
+          </w:p>
+        </w:tc>
+      </w:tr>
+    </w:tbl>
+    <w:p>
+      <w:pPr>
+        <w:spacing w:after="120"/>
+      </w:pPr>
+    </w:p>
+    <w:p>
+      <w:pPr>
+        <w:spacing w:after="120"/>
+      </w:pPr>
+      <w:r>
+        <w:t xml:space="preserve">La comparación de huellas se hace en tiempo constante. Una comparación corriente se detiene en el primer carácter distinto, y el tiempo que tarda revela cuántos coincidían; con suficientes intentos eso permite reconstruir el valor carácter a carácter. Por otra parte, el nombre del usuario se escapa antes de insertarlo en el mensaje, porque lo elige él mismo al registrarse y de lo contrario podría introducir código en el correo que reciben otros.</w:t>
+      </w:r>
+    </w:p>
+    <w:p>
+      <w:pPr>
+        <w:pStyle w:val="Ttulo3"/>
+      </w:pPr>
+      <w:r>
+        <w:t xml:space="preserve">Elección del proveedor de envío</w:t>
+      </w:r>
+    </w:p>
+    <w:p>
+      <w:pPr>
+        <w:spacing w:after="120"/>
+      </w:pPr>
+      <w:r>
+        <w:t xml:space="preserve">La selección estuvo condicionada por dos restricciones del proyecto. La primera, no incorporar dependencias nuevas, descartó las librerías habituales de correo y llevó a usar la interfaz HTTP del proveedor directamente, con la función de red que Node ya incluye.</w:t>
+      </w:r>
+    </w:p>
+    <w:p>
+      <w:pPr>
+        <w:spacing w:after="120"/>
+      </w:pPr>
+      <w:r>
+        <w:t xml:space="preserve">La segunda fue decisiva: el sistema se publica bajo un subdominio de la plataforma de despliegue, de modo que no se dispone de un dominio propio. Varios proveedores exigen verificar un dominio para autorizar envíos a terceros, y en sus planes gratuitos solo permiten escribir a la propia dirección del titular de la cuenta, lo que resulta inútil para un sistema con varios usuarios. Se optó por un proveedor que permite verificar una sola dirección de remitente, suficiente para operar sin dominio.</w:t>
+      </w:r>
+    </w:p>
+    <w:p>
+      <w:pPr>
+        <w:shd w:val="clear" w:color="auto" w:fill="F2F2F2"/>
+        <w:spacing w:before="300" w:after="300"/>
+        <w:ind w:left="360" w:right="360"/>
+      </w:pPr>
+      <w:r>
+        <w:t xml:space="preserve">Si falta la configuración de envío, el sistema arranca con normalidad pero la recuperación responde indicando que la función no está disponible. Se prefirió esa respuesta explícita antes que aceptar la solicitud y no enviar nada: un usuario esperando indefinidamente un correo que nunca sale es peor que un mensaje claro de indisponibilidad.</w:t>
+      </w:r>
+    </w:p>
+    <w:p>
+      <w:pPr>
+        <w:pStyle w:val="Ttulo3"/>
+      </w:pPr>
+      <w:r>
+        <w:t xml:space="preserve">Una incidencia durante la puesta en marcha</w:t>
+      </w:r>
+    </w:p>
+    <w:p>
+      <w:pPr>
+        <w:spacing w:after="120"/>
+      </w:pPr>
+      <w:r>
+        <w:t xml:space="preserve">El primer intento de envío falló con un error de autenticación. La causa resultó ser que la clave de acceso se había generado sin asignarle permisos: el panel del proveedor permite crearla en ese estado y advierte de ello en un texto discreto, fácil de pasar por alto. Se aprovechó el diagnóstico para dos mejoras: los valores de configuración se recortan de espacios invisibles al pegarlos, causa frecuente del mismo error, y el registro del servidor nombra ahora la causa probable según el código de respuesta, en lugar de limitarse al número.</w:t>
+      </w:r>
+    </w:p>
+    <w:p>
+      <w:r>
+        <w:br w:type="page"/>
+      </w:r>
+    </w:p>
+    <w:p>
+      <w:pPr>
+        <w:pStyle w:val="Ttulo2"/>
+        <w:pBdr>
+          <w:bottom w:val="single" w:sz="4" w:space="0" w:color="2E75B6"/>
+        </w:pBdr>
+      </w:pPr>
+      <w:r>
+        <w:t xml:space="preserve">30.9. Pruebas automatizadas e integración continua</w:t>
+      </w:r>
+    </w:p>
+    <w:p>
+      <w:pPr>
+        <w:spacing w:after="120"/>
+      </w:pPr>
+      <w:r>
+        <w:t xml:space="preserve">El proyecto no contaba con ninguna prueba automatizada. Las verificaciones descritas en este documento se realizaron a mano, una por una, lo que las hace fiables en el momento de ejecutarlas pero no impide que un cambio posterior deshaga lo corregido sin que nadie lo note.</w:t>
+      </w:r>
+    </w:p>
+    <w:p>
+      <w:pPr>
+        <w:spacing w:after="120"/>
+      </w:pPr>
+      <w:r>
+        <w:t xml:space="preserve">Se incorporaron 58 pruebas utilizando el ejecutor que trae Node de serie, sin ninguna dependencia adicional, respetando la restricción del proyecto.</w:t>
+      </w:r>
+    </w:p>
+    <w:tbl>
+      <w:tblPr>
+        <w:tblW w:w="9360" w:type="dxa"/>
+        <w:tblBorders>
+          <w:top w:val="single" w:sz="4" w:space="0" w:color="auto"/>
+          <w:left w:val="single" w:sz="4" w:space="0" w:color="auto"/>
+          <w:bottom w:val="single" w:sz="4" w:space="0" w:color="auto"/>
+          <w:right w:val="single" w:sz="4" w:space="0" w:color="auto"/>
+          <w:insideH w:val="single" w:sz="4" w:space="0" w:color="auto"/>
+          <w:insideV w:val="single" w:sz="4" w:space="0" w:color="auto"/>
+        </w:tblBorders>
+        <w:tblCellMar>
+          <w:left w:w="10" w:type="dxa"/>
+          <w:right w:w="10" w:type="dxa"/>
+        </w:tblCellMar>
+        <w:tblLook w:val="04A0" w:firstRow="1" w:lastRow="0" w:firstColumn="1" w:lastColumn="0" w:noHBand="0" w:noVBand="1"/>
+      </w:tblPr>
+      <w:tblGrid>
+        <w:gridCol w:w="2808"/>
+        <w:gridCol w:w="6552"/>
+      </w:tblGrid>
+      <w:tr>
+        <w:trPr>
+          <w:tblHeader/>
+        </w:trPr>
+        <w:tc>
+          <w:tcPr>
+            <w:tcW w:w="2808" w:type="dxa"/>
+            <w:tcBorders>
+              <w:top w:val="single" w:sz="1" w:space="0" w:color="CCCCCC"/>
+              <w:left w:val="single" w:sz="1" w:space="0" w:color="CCCCCC"/>
+              <w:bottom w:val="single" w:sz="1" w:space="0" w:color="CCCCCC"/>
+              <w:right w:val="single" w:sz="1" w:space="0" w:color="CCCCCC"/>
+            </w:tcBorders>
+            <w:shd w:val="clear" w:color="auto" w:fill="1E3A5F"/>
+            <w:tcMar>
+              <w:top w:w="80" w:type="dxa"/>
+              <w:left w:w="120" w:type="dxa"/>
+              <w:bottom w:w="80" w:type="dxa"/>
+              <w:right w:w="120" w:type="dxa"/>
+            </w:tcMar>
+          </w:tcPr>
+          <w:p>
+            <w:pPr>
+              <w:spacing w:after="0"/>
+            </w:pPr>
+            <w:r>
+              <w:rPr>
+                <w:b/>
+                <w:bCs/>
+                <w:color w:val="FFFFFF"/>
+                <w:sz w:val="18"/>
+                <w:szCs w:val="18"/>
+              </w:rPr>
+              <w:t xml:space="preserve">Conjunto</w:t>
+            </w:r>
+          </w:p>
+        </w:tc>
+        <w:tc>
+          <w:tcPr>
+            <w:tcW w:w="6552" w:type="dxa"/>
+            <w:tcBorders>
+              <w:top w:val="single" w:sz="1" w:space="0" w:color="CCCCCC"/>
+              <w:left w:val="single" w:sz="1" w:space="0" w:color="CCCCCC"/>
+              <w:bottom w:val="single" w:sz="1" w:space="0" w:color="CCCCCC"/>
+              <w:right w:val="single" w:sz="1" w:space="0" w:color="CCCCCC"/>
+            </w:tcBorders>
+            <w:shd w:val="clear" w:color="auto" w:fill="1E3A5F"/>
+            <w:tcMar>
+              <w:top w:w="80" w:type="dxa"/>
+              <w:left w:w="120" w:type="dxa"/>
+              <w:bottom w:w="80" w:type="dxa"/>
+              <w:right w:w="120" w:type="dxa"/>
+            </w:tcMar>
+          </w:tcPr>
+          <w:p>
+            <w:pPr>
+              <w:spacing w:after="0"/>
+            </w:pPr>
+            <w:r>
+              <w:rPr>
+                <w:b/>
+                <w:bCs/>
+                <w:color w:val="FFFFFF"/>
+                <w:sz w:val="18"/>
+                <w:szCs w:val="18"/>
+              </w:rPr>
+              <w:t xml:space="preserve">Qué comprueba</w:t>
+            </w:r>
+          </w:p>
+        </w:tc>
+      </w:tr>
+      <w:tr>
+        <w:tc>
+          <w:tcPr>
+            <w:tcW w:w="2808" w:type="dxa"/>
+            <w:tcBorders>
+              <w:top w:val="single" w:sz="1" w:space="0" w:color="CCCCCC"/>
+              <w:left w:val="single" w:sz="1" w:space="0" w:color="CCCCCC"/>
+              <w:bottom w:val="single" w:sz="1" w:space="0" w:color="CCCCCC"/>
+              <w:right w:val="single" w:sz="1" w:space="0" w:color="CCCCCC"/>
+            </w:tcBorders>
+            <w:shd w:val="clear" w:color="auto" w:fill="FFFFFF"/>
+            <w:tcMar>
+              <w:top w:w="80" w:type="dxa"/>
+              <w:left w:w="120" w:type="dxa"/>
+              <w:bottom w:w="80" w:type="dxa"/>
+              <w:right w:w="120" w:type="dxa"/>
+            </w:tcMar>
+          </w:tcPr>
+          <w:p>
+            <w:pPr>
+              <w:spacing w:after="0"/>
+            </w:pPr>
+            <w:r>
+              <w:rPr>
+                <w:color w:val="1A1A2E"/>
+                <w:sz w:val="18"/>
+                <w:szCs w:val="18"/>
+              </w:rPr>
+              <w:t xml:space="preserve">Validadores</w:t>
+            </w:r>
+          </w:p>
+        </w:tc>
+        <w:tc>
+          <w:tcPr>
+            <w:tcW w:w="6552" w:type="dxa"/>
+            <w:tcBorders>
+              <w:top w:val="single" w:sz="1" w:space="0" w:color="CCCCCC"/>
+              <w:left w:val="single" w:sz="1" w:space="0" w:color="CCCCCC"/>
+              <w:bottom w:val="single" w:sz="1" w:space="0" w:color="CCCCCC"/>
+              <w:right w:val="single" w:sz="1" w:space="0" w:color="CCCCCC"/>
+            </w:tcBorders>
+            <w:shd w:val="clear" w:color="auto" w:fill="FFFFFF"/>
+            <w:tcMar>
+              <w:top w:w="80" w:type="dxa"/>
+              <w:left w:w="120" w:type="dxa"/>
+              <w:bottom w:w="80" w:type="dxa"/>
+              <w:right w:w="120" w:type="dxa"/>
+            </w:tcMar>
+          </w:tcPr>
+          <w:p>
+            <w:pPr>
+              <w:spacing w:after="0"/>
+            </w:pPr>
+            <w:r>
+              <w:rPr>
+                <w:color w:val="1A1A2E"/>
+                <w:sz w:val="18"/>
+                <w:szCs w:val="18"/>
+              </w:rPr>
+              <w:t xml:space="preserve">Formato de correo y de cédula, longitud del nombre, política de contraseña y normalización de la entrada.</w:t>
+            </w:r>
+          </w:p>
+        </w:tc>
+      </w:tr>
+      <w:tr>
+        <w:tc>
+          <w:tcPr>
+            <w:tcW w:w="2808" w:type="dxa"/>
+            <w:tcBorders>
+              <w:top w:val="single" w:sz="1" w:space="0" w:color="CCCCCC"/>
+              <w:left w:val="single" w:sz="1" w:space="0" w:color="CCCCCC"/>
+              <w:bottom w:val="single" w:sz="1" w:space="0" w:color="CCCCCC"/>
+              <w:right w:val="single" w:sz="1" w:space="0" w:color="CCCCCC"/>
+            </w:tcBorders>
+            <w:shd w:val="clear" w:color="auto" w:fill="F7F9FC"/>
+            <w:tcMar>
+              <w:top w:w="80" w:type="dxa"/>
+              <w:left w:w="120" w:type="dxa"/>
+              <w:bottom w:w="80" w:type="dxa"/>
+              <w:right w:w="120" w:type="dxa"/>
+            </w:tcMar>
+          </w:tcPr>
+          <w:p>
+            <w:pPr>
+              <w:spacing w:after="0"/>
+            </w:pPr>
+            <w:r>
+              <w:rPr>
+                <w:color w:val="1A1A2E"/>
+                <w:sz w:val="18"/>
+                <w:szCs w:val="18"/>
+              </w:rPr>
+              <w:t xml:space="preserve">Reglas de negocio</w:t>
+            </w:r>
+          </w:p>
+        </w:tc>
+        <w:tc>
+          <w:tcPr>
+            <w:tcW w:w="6552" w:type="dxa"/>
+            <w:tcBorders>
+              <w:top w:val="single" w:sz="1" w:space="0" w:color="CCCCCC"/>
+              <w:left w:val="single" w:sz="1" w:space="0" w:color="CCCCCC"/>
+              <w:bottom w:val="single" w:sz="1" w:space="0" w:color="CCCCCC"/>
+              <w:right w:val="single" w:sz="1" w:space="0" w:color="CCCCCC"/>
+            </w:tcBorders>
+            <w:shd w:val="clear" w:color="auto" w:fill="F7F9FC"/>
+            <w:tcMar>
+              <w:top w:w="80" w:type="dxa"/>
+              <w:left w:w="120" w:type="dxa"/>
+              <w:bottom w:w="80" w:type="dxa"/>
+              <w:right w:w="120" w:type="dxa"/>
+            </w:tcMar>
+          </w:tcPr>
+          <w:p>
+            <w:pPr>
+              <w:spacing w:after="0"/>
+            </w:pPr>
+            <w:r>
+              <w:rPr>
+                <w:color w:val="1A1A2E"/>
+                <w:sz w:val="18"/>
+                <w:szCs w:val="18"/>
+              </w:rPr>
+              <w:t xml:space="preserve">La regla Anti-Passback y el criterio que determina si una imagen del proveedor astronómico puede usarse sin infringir derechos de autor.</w:t>
+            </w:r>
+          </w:p>
+        </w:tc>
+      </w:tr>
+      <w:tr>
+        <w:tc>
+          <w:tcPr>
+            <w:tcW w:w="2808" w:type="dxa"/>
+            <w:tcBorders>
+              <w:top w:val="single" w:sz="1" w:space="0" w:color="CCCCCC"/>
+              <w:left w:val="single" w:sz="1" w:space="0" w:color="CCCCCC"/>
+              <w:bottom w:val="single" w:sz="1" w:space="0" w:color="CCCCCC"/>
+              <w:right w:val="single" w:sz="1" w:space="0" w:color="CCCCCC"/>
+            </w:tcBorders>
+            <w:shd w:val="clear" w:color="auto" w:fill="FFFFFF"/>
+            <w:tcMar>
+              <w:top w:w="80" w:type="dxa"/>
+              <w:left w:w="120" w:type="dxa"/>
+              <w:bottom w:w="80" w:type="dxa"/>
+              <w:right w:w="120" w:type="dxa"/>
+            </w:tcMar>
+          </w:tcPr>
+          <w:p>
+            <w:pPr>
+              <w:spacing w:after="0"/>
+            </w:pPr>
+            <w:r>
+              <w:rPr>
+                <w:color w:val="1A1A2E"/>
+                <w:sz w:val="18"/>
+                <w:szCs w:val="18"/>
+              </w:rPr>
+              <w:t xml:space="preserve">Limitador de peticiones</w:t>
+            </w:r>
+          </w:p>
+        </w:tc>
+        <w:tc>
+          <w:tcPr>
+            <w:tcW w:w="6552" w:type="dxa"/>
+            <w:tcBorders>
+              <w:top w:val="single" w:sz="1" w:space="0" w:color="CCCCCC"/>
+              <w:left w:val="single" w:sz="1" w:space="0" w:color="CCCCCC"/>
+              <w:bottom w:val="single" w:sz="1" w:space="0" w:color="CCCCCC"/>
+              <w:right w:val="single" w:sz="1" w:space="0" w:color="CCCCCC"/>
+            </w:tcBorders>
+            <w:shd w:val="clear" w:color="auto" w:fill="FFFFFF"/>
+            <w:tcMar>
+              <w:top w:w="80" w:type="dxa"/>
+              <w:left w:w="120" w:type="dxa"/>
+              <w:bottom w:w="80" w:type="dxa"/>
+              <w:right w:w="120" w:type="dxa"/>
+            </w:tcMar>
+          </w:tcPr>
+          <w:p>
+            <w:pPr>
+              <w:spacing w:after="0"/>
+            </w:pPr>
+            <w:r>
+              <w:rPr>
+                <w:color w:val="1A1A2E"/>
+                <w:sz w:val="18"/>
+                <w:szCs w:val="18"/>
+              </w:rPr>
+              <w:t xml:space="preserve">Conteo independiente por dirección y por endpoint, código de rechazo, cabecera de reintento, expiración de la ventana y lectura correcta de la cabecera que envía el proxy inverso.</w:t>
+            </w:r>
+          </w:p>
+        </w:tc>
+      </w:tr>
+      <w:tr>
+        <w:tc>
+          <w:tcPr>
+            <w:tcW w:w="2808" w:type="dxa"/>
+            <w:tcBorders>
+              <w:top w:val="single" w:sz="1" w:space="0" w:color="CCCCCC"/>
+              <w:left w:val="single" w:sz="1" w:space="0" w:color="CCCCCC"/>
+              <w:bottom w:val="single" w:sz="1" w:space="0" w:color="CCCCCC"/>
+              <w:right w:val="single" w:sz="1" w:space="0" w:color="CCCCCC"/>
+            </w:tcBorders>
+            <w:shd w:val="clear" w:color="auto" w:fill="F7F9FC"/>
+            <w:tcMar>
+              <w:top w:w="80" w:type="dxa"/>
+              <w:left w:w="120" w:type="dxa"/>
+              <w:bottom w:w="80" w:type="dxa"/>
+              <w:right w:w="120" w:type="dxa"/>
+            </w:tcMar>
+          </w:tcPr>
+          <w:p>
+            <w:pPr>
+              <w:spacing w:after="0"/>
+            </w:pPr>
+            <w:r>
+              <w:rPr>
+                <w:color w:val="1A1A2E"/>
+                <w:sz w:val="18"/>
+                <w:szCs w:val="18"/>
+              </w:rPr>
+              <w:t xml:space="preserve">Autorización</w:t>
+            </w:r>
+          </w:p>
+        </w:tc>
+        <w:tc>
+          <w:tcPr>
+            <w:tcW w:w="6552" w:type="dxa"/>
+            <w:tcBorders>
+              <w:top w:val="single" w:sz="1" w:space="0" w:color="CCCCCC"/>
+              <w:left w:val="single" w:sz="1" w:space="0" w:color="CCCCCC"/>
+              <w:bottom w:val="single" w:sz="1" w:space="0" w:color="CCCCCC"/>
+              <w:right w:val="single" w:sz="1" w:space="0" w:color="CCCCCC"/>
+            </w:tcBorders>
+            <w:shd w:val="clear" w:color="auto" w:fill="F7F9FC"/>
+            <w:tcMar>
+              <w:top w:w="80" w:type="dxa"/>
+              <w:left w:w="120" w:type="dxa"/>
+              <w:bottom w:w="80" w:type="dxa"/>
+              <w:right w:w="120" w:type="dxa"/>
+            </w:tcMar>
+          </w:tcPr>
+          <w:p>
+            <w:pPr>
+              <w:spacing w:after="0"/>
+            </w:pPr>
+            <w:r>
+              <w:rPr>
+                <w:color w:val="1A1A2E"/>
+                <w:sz w:val="18"/>
+                <w:szCs w:val="18"/>
+              </w:rPr>
+              <w:t xml:space="preserve">Token ausente, sin esquema, manipulado, caducado y válido; permisos de administrador; y las tres vías de acceso al terminal de kiosco, incluida la petición anónima que antes pasaba.</w:t>
+            </w:r>
+          </w:p>
+        </w:tc>
+      </w:tr>
+      <w:tr>
+        <w:tc>
+          <w:tcPr>
+            <w:tcW w:w="2808" w:type="dxa"/>
+            <w:tcBorders>
+              <w:top w:val="single" w:sz="1" w:space="0" w:color="CCCCCC"/>
+              <w:left w:val="single" w:sz="1" w:space="0" w:color="CCCCCC"/>
+              <w:bottom w:val="single" w:sz="1" w:space="0" w:color="CCCCCC"/>
+              <w:right w:val="single" w:sz="1" w:space="0" w:color="CCCCCC"/>
+            </w:tcBorders>
+            <w:shd w:val="clear" w:color="auto" w:fill="FFFFFF"/>
+            <w:tcMar>
+              <w:top w:w="80" w:type="dxa"/>
+              <w:left w:w="120" w:type="dxa"/>
+              <w:bottom w:w="80" w:type="dxa"/>
+              <w:right w:w="120" w:type="dxa"/>
+            </w:tcMar>
+          </w:tcPr>
+          <w:p>
+            <w:pPr>
+              <w:spacing w:after="0"/>
+            </w:pPr>
+            <w:r>
+              <w:rPr>
+                <w:color w:val="1A1A2E"/>
+                <w:sz w:val="18"/>
+                <w:szCs w:val="18"/>
+              </w:rPr>
+              <w:t xml:space="preserve">Recuperación de contraseña</w:t>
+            </w:r>
+          </w:p>
+        </w:tc>
+        <w:tc>
+          <w:tcPr>
+            <w:tcW w:w="6552" w:type="dxa"/>
+            <w:tcBorders>
+              <w:top w:val="single" w:sz="1" w:space="0" w:color="CCCCCC"/>
+              <w:left w:val="single" w:sz="1" w:space="0" w:color="CCCCCC"/>
+              <w:bottom w:val="single" w:sz="1" w:space="0" w:color="CCCCCC"/>
+              <w:right w:val="single" w:sz="1" w:space="0" w:color="CCCCCC"/>
+            </w:tcBorders>
+            <w:shd w:val="clear" w:color="auto" w:fill="FFFFFF"/>
+            <w:tcMar>
+              <w:top w:w="80" w:type="dxa"/>
+              <w:left w:w="120" w:type="dxa"/>
+              <w:bottom w:w="80" w:type="dxa"/>
+              <w:right w:w="120" w:type="dxa"/>
+            </w:tcMar>
+          </w:tcPr>
+          <w:p>
+            <w:pPr>
+              <w:spacing w:after="0"/>
+            </w:pPr>
+            <w:r>
+              <w:rPr>
+                <w:color w:val="1A1A2E"/>
+                <w:sz w:val="18"/>
+                <w:szCs w:val="18"/>
+              </w:rPr>
+              <w:t xml:space="preserve">Unicidad y entropía del token, correspondencia con su huella, comparación en tiempo constante, vigencia, construcción del enlace y contenido del correo.</w:t>
+            </w:r>
+          </w:p>
+        </w:tc>
+      </w:tr>
+    </w:tbl>
+    <w:p>
+      <w:pPr>
+        <w:spacing w:after="120"/>
+      </w:pPr>
+    </w:p>
+    <w:p>
+      <w:pPr>
+        <w:spacing w:after="120"/>
+      </w:pPr>
+      <w:r>
+        <w:t xml:space="preserve">Para poder probar sin base de datos ni acceso a la red, dos reglas de negocio se extrajeron a funciones independientes y sin efectos secundarios. El comportamiento del sistema no cambia; lo que cambia es que esas reglas pueden ahora examinarse de forma aislada.</w:t>
+      </w:r>
+    </w:p>
+    <w:p>
+      <w:pPr>
+        <w:pStyle w:val="Ttulo3"/>
+      </w:pPr>
+      <w:r>
+        <w:t xml:space="preserve">Integración continua</w:t>
+      </w:r>
+    </w:p>
+    <w:p>
+      <w:pPr>
+        <w:spacing w:after="120"/>
+      </w:pPr>
+      <w:r>
+        <w:t xml:space="preserve">Las pruebas se ejecutan automáticamente en cada cambio enviado al repositorio. El proceso instala las dependencias con el comando de instalación limpia, ejecuta las pruebas, compila la interfaz y audita las librerías de ambos proyectos. Se emplea la instalación limpia y no la corriente porque la primera falla si el archivo de bloqueo no concuerda con el de dependencias, que es precisamente la condición que rompería el despliegue.</w:t>
+      </w:r>
+    </w:p>
+    <w:p>
+      <w:pPr>
+        <w:spacing w:after="120"/>
+      </w:pPr>
+      <w:r>
+        <w:t xml:space="preserve">El servicio de backend se ejecuta en la misma versión del entorno que utiliza la plataforma de producción, de manera que un fallo dependiente de la versión se manifieste durante la verificación y no después de publicar.</w:t>
+      </w:r>
+    </w:p>
+    <w:p>
+      <w:pPr>
+        <w:shd w:val="clear" w:color="auto" w:fill="F2F2F2"/>
+        <w:spacing w:before="300" w:after="300"/>
+        <w:ind w:left="360" w:right="360"/>
+      </w:pPr>
+      <w:r>
+        <w:t xml:space="preserve">La primera ejecución dejó una prueba en rojo, y el error estaba en la prueba, no en el sistema: afirmaba que un correo de cien caracteres debía rechazarse, cuando cien es exactamente el límite admitido. Conviene retener el episodio, porque ilustra dos cosas: que una prueba que falla no siempre acusa al código, y que escribir pruebas obliga a precisar qué significa exactamente cada regla, cosa que leer el código no siempre exige.</w:t>
+      </w:r>
+    </w:p>
+    <w:p>
+      <w:pPr>
+        <w:spacing w:after="120"/>
+      </w:pPr>
+      <w:r>
+        <w:t xml:space="preserve">El valor de este trabajo no está en las pruebas como documento, sino en lo que protegen. Las correcciones descritas en los apartados anteriores —que el terminal de kiosco no acepte peticiones anónimas, que la regla Anti-Passback alterne los movimientos, que el enlace de recuperación sirva una sola vez— quedan ahora verificadas de forma automática en cada cambio. Un descuido futuro que las deshiciera se detendría antes de llegar a producción.</w:t>
       </w:r>
     </w:p>
     <w:p>

</xml_diff>